<commit_message>
Fix senior program deep links
</commit_message>
<xml_diff>
--- a/Year-11-Design-and-Technology/documents/Year-11-Design-and-Technology-120-Hour-Teaching-Program.docx
+++ b/Year-11-Design-and-Technology/documents/Year-11-Design-and-Technology-120-Hour-Teaching-Program.docx
@@ -4854,7 +4854,7 @@
               <w:keepNext w:val="0"/>
               <w:spacing w:before="0" w:after="0" w:line="240" w:lineRule="auto"/>
             </w:pPr>
-            <w:hyperlink r:id="rId12" w:history="1">
+            <w:hyperlink r:id="rId15" w:history="1">
               <w:r>
                 <w:rPr>
                   <w:rFonts w:ascii="Arial" w:hAnsi="Arial"/>
@@ -5052,7 +5052,7 @@
               <w:keepNext w:val="0"/>
               <w:spacing w:before="0" w:after="0" w:line="240" w:lineRule="auto"/>
             </w:pPr>
-            <w:hyperlink r:id="rId12" w:history="1">
+            <w:hyperlink r:id="rId16" w:history="1">
               <w:r>
                 <w:rPr>
                   <w:rFonts w:ascii="Arial" w:hAnsi="Arial"/>
@@ -5250,7 +5250,7 @@
               <w:keepNext w:val="0"/>
               <w:spacing w:before="0" w:after="0" w:line="240" w:lineRule="auto"/>
             </w:pPr>
-            <w:hyperlink r:id="rId12" w:history="1">
+            <w:hyperlink r:id="rId17" w:history="1">
               <w:r>
                 <w:rPr>
                   <w:rFonts w:ascii="Arial" w:hAnsi="Arial"/>
@@ -5448,7 +5448,7 @@
               <w:keepNext w:val="0"/>
               <w:spacing w:before="0" w:after="0" w:line="240" w:lineRule="auto"/>
             </w:pPr>
-            <w:hyperlink r:id="rId12" w:history="1">
+            <w:hyperlink r:id="rId17" w:history="1">
               <w:r>
                 <w:rPr>
                   <w:rFonts w:ascii="Arial" w:hAnsi="Arial"/>
@@ -5646,7 +5646,7 @@
               <w:keepNext w:val="0"/>
               <w:spacing w:before="0" w:after="0" w:line="240" w:lineRule="auto"/>
             </w:pPr>
-            <w:hyperlink r:id="rId12" w:history="1">
+            <w:hyperlink r:id="rId15" w:history="1">
               <w:r>
                 <w:rPr>
                   <w:rFonts w:ascii="Arial" w:hAnsi="Arial"/>
@@ -5844,7 +5844,7 @@
               <w:keepNext w:val="0"/>
               <w:spacing w:before="0" w:after="0" w:line="240" w:lineRule="auto"/>
             </w:pPr>
-            <w:hyperlink r:id="rId12" w:history="1">
+            <w:hyperlink r:id="rId16" w:history="1">
               <w:r>
                 <w:rPr>
                   <w:rFonts w:ascii="Arial" w:hAnsi="Arial"/>
@@ -6042,7 +6042,7 @@
               <w:keepNext w:val="0"/>
               <w:spacing w:before="0" w:after="0" w:line="240" w:lineRule="auto"/>
             </w:pPr>
-            <w:hyperlink r:id="rId12" w:history="1">
+            <w:hyperlink r:id="rId17" w:history="1">
               <w:r>
                 <w:rPr>
                   <w:rFonts w:ascii="Arial" w:hAnsi="Arial"/>
@@ -6240,7 +6240,7 @@
               <w:keepNext w:val="0"/>
               <w:spacing w:before="0" w:after="0" w:line="240" w:lineRule="auto"/>
             </w:pPr>
-            <w:hyperlink r:id="rId12" w:history="1">
+            <w:hyperlink r:id="rId17" w:history="1">
               <w:r>
                 <w:rPr>
                   <w:rFonts w:ascii="Arial" w:hAnsi="Arial"/>
@@ -6438,7 +6438,7 @@
               <w:keepNext w:val="0"/>
               <w:spacing w:before="0" w:after="0" w:line="240" w:lineRule="auto"/>
             </w:pPr>
-            <w:hyperlink r:id="rId12" w:history="1">
+            <w:hyperlink r:id="rId18" w:history="1">
               <w:r>
                 <w:rPr>
                   <w:rFonts w:ascii="Arial" w:hAnsi="Arial"/>
@@ -6636,7 +6636,7 @@
               <w:keepNext w:val="0"/>
               <w:spacing w:before="0" w:after="0" w:line="240" w:lineRule="auto"/>
             </w:pPr>
-            <w:hyperlink r:id="rId12" w:history="1">
+            <w:hyperlink r:id="rId19" w:history="1">
               <w:r>
                 <w:rPr>
                   <w:rFonts w:ascii="Arial" w:hAnsi="Arial"/>
@@ -6834,7 +6834,7 @@
               <w:keepNext w:val="0"/>
               <w:spacing w:before="0" w:after="0" w:line="240" w:lineRule="auto"/>
             </w:pPr>
-            <w:hyperlink r:id="rId12" w:history="1">
+            <w:hyperlink r:id="rId20" w:history="1">
               <w:r>
                 <w:rPr>
                   <w:rFonts w:ascii="Arial" w:hAnsi="Arial"/>
@@ -7032,7 +7032,7 @@
               <w:keepNext w:val="0"/>
               <w:spacing w:before="0" w:after="0" w:line="240" w:lineRule="auto"/>
             </w:pPr>
-            <w:hyperlink r:id="rId12" w:history="1">
+            <w:hyperlink r:id="rId21" w:history="1">
               <w:r>
                 <w:rPr>
                   <w:rFonts w:ascii="Arial" w:hAnsi="Arial"/>
@@ -7230,7 +7230,7 @@
               <w:keepNext w:val="0"/>
               <w:spacing w:before="0" w:after="0" w:line="240" w:lineRule="auto"/>
             </w:pPr>
-            <w:hyperlink r:id="rId12" w:history="1">
+            <w:hyperlink r:id="rId18" w:history="1">
               <w:r>
                 <w:rPr>
                   <w:rFonts w:ascii="Arial" w:hAnsi="Arial"/>
@@ -7428,7 +7428,7 @@
               <w:keepNext w:val="0"/>
               <w:spacing w:before="0" w:after="0" w:line="240" w:lineRule="auto"/>
             </w:pPr>
-            <w:hyperlink r:id="rId12" w:history="1">
+            <w:hyperlink r:id="rId19" w:history="1">
               <w:r>
                 <w:rPr>
                   <w:rFonts w:ascii="Arial" w:hAnsi="Arial"/>
@@ -7626,7 +7626,7 @@
               <w:keepNext w:val="0"/>
               <w:spacing w:before="0" w:after="0" w:line="240" w:lineRule="auto"/>
             </w:pPr>
-            <w:hyperlink r:id="rId12" w:history="1">
+            <w:hyperlink r:id="rId20" w:history="1">
               <w:r>
                 <w:rPr>
                   <w:rFonts w:ascii="Arial" w:hAnsi="Arial"/>
@@ -7824,7 +7824,7 @@
               <w:keepNext w:val="0"/>
               <w:spacing w:before="0" w:after="0" w:line="240" w:lineRule="auto"/>
             </w:pPr>
-            <w:hyperlink r:id="rId12" w:history="1">
+            <w:hyperlink r:id="rId21" w:history="1">
               <w:r>
                 <w:rPr>
                   <w:rFonts w:ascii="Arial" w:hAnsi="Arial"/>
@@ -8022,7 +8022,7 @@
               <w:keepNext w:val="0"/>
               <w:spacing w:before="0" w:after="0" w:line="240" w:lineRule="auto"/>
             </w:pPr>
-            <w:hyperlink r:id="rId12" w:history="1">
+            <w:hyperlink r:id="rId18" w:history="1">
               <w:r>
                 <w:rPr>
                   <w:rFonts w:ascii="Arial" w:hAnsi="Arial"/>
@@ -8220,7 +8220,7 @@
               <w:keepNext w:val="0"/>
               <w:spacing w:before="0" w:after="0" w:line="240" w:lineRule="auto"/>
             </w:pPr>
-            <w:hyperlink r:id="rId12" w:history="1">
+            <w:hyperlink r:id="rId19" w:history="1">
               <w:r>
                 <w:rPr>
                   <w:rFonts w:ascii="Arial" w:hAnsi="Arial"/>
@@ -8418,7 +8418,7 @@
               <w:keepNext w:val="0"/>
               <w:spacing w:before="0" w:after="0" w:line="240" w:lineRule="auto"/>
             </w:pPr>
-            <w:hyperlink r:id="rId12" w:history="1">
+            <w:hyperlink r:id="rId20" w:history="1">
               <w:r>
                 <w:rPr>
                   <w:rFonts w:ascii="Arial" w:hAnsi="Arial"/>
@@ -8616,7 +8616,7 @@
               <w:keepNext w:val="0"/>
               <w:spacing w:before="0" w:after="0" w:line="240" w:lineRule="auto"/>
             </w:pPr>
-            <w:hyperlink r:id="rId12" w:history="1">
+            <w:hyperlink r:id="rId21" w:history="1">
               <w:r>
                 <w:rPr>
                   <w:rFonts w:ascii="Arial" w:hAnsi="Arial"/>
@@ -8814,7 +8814,7 @@
               <w:keepNext w:val="0"/>
               <w:spacing w:before="0" w:after="0" w:line="240" w:lineRule="auto"/>
             </w:pPr>
-            <w:hyperlink r:id="rId12" w:history="1">
+            <w:hyperlink r:id="rId22" w:history="1">
               <w:r>
                 <w:rPr>
                   <w:rFonts w:ascii="Arial" w:hAnsi="Arial"/>
@@ -9012,7 +9012,7 @@
               <w:keepNext w:val="0"/>
               <w:spacing w:before="0" w:after="0" w:line="240" w:lineRule="auto"/>
             </w:pPr>
-            <w:hyperlink r:id="rId12" w:history="1">
+            <w:hyperlink r:id="rId23" w:history="1">
               <w:r>
                 <w:rPr>
                   <w:rFonts w:ascii="Arial" w:hAnsi="Arial"/>
@@ -9210,7 +9210,7 @@
               <w:keepNext w:val="0"/>
               <w:spacing w:before="0" w:after="0" w:line="240" w:lineRule="auto"/>
             </w:pPr>
-            <w:hyperlink r:id="rId12" w:history="1">
+            <w:hyperlink r:id="rId23" w:history="1">
               <w:r>
                 <w:rPr>
                   <w:rFonts w:ascii="Arial" w:hAnsi="Arial"/>
@@ -9408,7 +9408,7 @@
               <w:keepNext w:val="0"/>
               <w:spacing w:before="0" w:after="0" w:line="240" w:lineRule="auto"/>
             </w:pPr>
-            <w:hyperlink r:id="rId12" w:history="1">
+            <w:hyperlink r:id="rId24" w:history="1">
               <w:r>
                 <w:rPr>
                   <w:rFonts w:ascii="Arial" w:hAnsi="Arial"/>
@@ -9606,7 +9606,7 @@
               <w:keepNext w:val="0"/>
               <w:spacing w:before="0" w:after="0" w:line="240" w:lineRule="auto"/>
             </w:pPr>
-            <w:hyperlink r:id="rId12" w:history="1">
+            <w:hyperlink r:id="rId25" w:history="1">
               <w:r>
                 <w:rPr>
                   <w:rFonts w:ascii="Arial" w:hAnsi="Arial"/>
@@ -9804,7 +9804,7 @@
               <w:keepNext w:val="0"/>
               <w:spacing w:before="0" w:after="0" w:line="240" w:lineRule="auto"/>
             </w:pPr>
-            <w:hyperlink r:id="rId12" w:history="1">
+            <w:hyperlink r:id="rId26" w:history="1">
               <w:r>
                 <w:rPr>
                   <w:rFonts w:ascii="Arial" w:hAnsi="Arial"/>
@@ -10002,7 +10002,7 @@
               <w:keepNext w:val="0"/>
               <w:spacing w:before="0" w:after="0" w:line="240" w:lineRule="auto"/>
             </w:pPr>
-            <w:hyperlink r:id="rId12" w:history="1">
+            <w:hyperlink r:id="rId22" w:history="1">
               <w:r>
                 <w:rPr>
                   <w:rFonts w:ascii="Arial" w:hAnsi="Arial"/>
@@ -10200,7 +10200,7 @@
               <w:keepNext w:val="0"/>
               <w:spacing w:before="0" w:after="0" w:line="240" w:lineRule="auto"/>
             </w:pPr>
-            <w:hyperlink r:id="rId12" w:history="1">
+            <w:hyperlink r:id="rId23" w:history="1">
               <w:r>
                 <w:rPr>
                   <w:rFonts w:ascii="Arial" w:hAnsi="Arial"/>
@@ -10398,7 +10398,7 @@
               <w:keepNext w:val="0"/>
               <w:spacing w:before="0" w:after="0" w:line="240" w:lineRule="auto"/>
             </w:pPr>
-            <w:hyperlink r:id="rId12" w:history="1">
+            <w:hyperlink r:id="rId23" w:history="1">
               <w:r>
                 <w:rPr>
                   <w:rFonts w:ascii="Arial" w:hAnsi="Arial"/>
@@ -10596,7 +10596,7 @@
               <w:keepNext w:val="0"/>
               <w:spacing w:before="0" w:after="0" w:line="240" w:lineRule="auto"/>
             </w:pPr>
-            <w:hyperlink r:id="rId12" w:history="1">
+            <w:hyperlink r:id="rId24" w:history="1">
               <w:r>
                 <w:rPr>
                   <w:rFonts w:ascii="Arial" w:hAnsi="Arial"/>
@@ -10794,7 +10794,7 @@
               <w:keepNext w:val="0"/>
               <w:spacing w:before="0" w:after="0" w:line="240" w:lineRule="auto"/>
             </w:pPr>
-            <w:hyperlink r:id="rId12" w:history="1">
+            <w:hyperlink r:id="rId25" w:history="1">
               <w:r>
                 <w:rPr>
                   <w:rFonts w:ascii="Arial" w:hAnsi="Arial"/>
@@ -10992,7 +10992,7 @@
               <w:keepNext w:val="0"/>
               <w:spacing w:before="0" w:after="0" w:line="240" w:lineRule="auto"/>
             </w:pPr>
-            <w:hyperlink r:id="rId12" w:history="1">
+            <w:hyperlink r:id="rId26" w:history="1">
               <w:r>
                 <w:rPr>
                   <w:rFonts w:ascii="Arial" w:hAnsi="Arial"/>
@@ -11190,7 +11190,7 @@
               <w:keepNext w:val="0"/>
               <w:spacing w:before="0" w:after="0" w:line="240" w:lineRule="auto"/>
             </w:pPr>
-            <w:hyperlink r:id="rId12" w:history="1">
+            <w:hyperlink r:id="rId22" w:history="1">
               <w:r>
                 <w:rPr>
                   <w:rFonts w:ascii="Arial" w:hAnsi="Arial"/>
@@ -11388,7 +11388,7 @@
               <w:keepNext w:val="0"/>
               <w:spacing w:before="0" w:after="0" w:line="240" w:lineRule="auto"/>
             </w:pPr>
-            <w:hyperlink r:id="rId12" w:history="1">
+            <w:hyperlink r:id="rId23" w:history="1">
               <w:r>
                 <w:rPr>
                   <w:rFonts w:ascii="Arial" w:hAnsi="Arial"/>
@@ -11586,7 +11586,7 @@
               <w:keepNext w:val="0"/>
               <w:spacing w:before="0" w:after="0" w:line="240" w:lineRule="auto"/>
             </w:pPr>
-            <w:hyperlink r:id="rId12" w:history="1">
+            <w:hyperlink r:id="rId23" w:history="1">
               <w:r>
                 <w:rPr>
                   <w:rFonts w:ascii="Arial" w:hAnsi="Arial"/>
@@ -11784,7 +11784,7 @@
               <w:keepNext w:val="0"/>
               <w:spacing w:before="0" w:after="0" w:line="240" w:lineRule="auto"/>
             </w:pPr>
-            <w:hyperlink r:id="rId12" w:history="1">
+            <w:hyperlink r:id="rId24" w:history="1">
               <w:r>
                 <w:rPr>
                   <w:rFonts w:ascii="Arial" w:hAnsi="Arial"/>
@@ -11982,7 +11982,7 @@
               <w:keepNext w:val="0"/>
               <w:spacing w:before="0" w:after="0" w:line="240" w:lineRule="auto"/>
             </w:pPr>
-            <w:hyperlink r:id="rId12" w:history="1">
+            <w:hyperlink r:id="rId25" w:history="1">
               <w:r>
                 <w:rPr>
                   <w:rFonts w:ascii="Arial" w:hAnsi="Arial"/>
@@ -12180,7 +12180,7 @@
               <w:keepNext w:val="0"/>
               <w:spacing w:before="0" w:after="0" w:line="240" w:lineRule="auto"/>
             </w:pPr>
-            <w:hyperlink r:id="rId12" w:history="1">
+            <w:hyperlink r:id="rId26" w:history="1">
               <w:r>
                 <w:rPr>
                   <w:rFonts w:ascii="Arial" w:hAnsi="Arial"/>
@@ -12378,7 +12378,7 @@
               <w:keepNext w:val="0"/>
               <w:spacing w:before="0" w:after="0" w:line="240" w:lineRule="auto"/>
             </w:pPr>
-            <w:hyperlink r:id="rId12" w:history="1">
+            <w:hyperlink r:id="rId22" w:history="1">
               <w:r>
                 <w:rPr>
                   <w:rFonts w:ascii="Arial" w:hAnsi="Arial"/>
@@ -12576,7 +12576,7 @@
               <w:keepNext w:val="0"/>
               <w:spacing w:before="0" w:after="0" w:line="240" w:lineRule="auto"/>
             </w:pPr>
-            <w:hyperlink r:id="rId12" w:history="1">
+            <w:hyperlink r:id="rId23" w:history="1">
               <w:r>
                 <w:rPr>
                   <w:rFonts w:ascii="Arial" w:hAnsi="Arial"/>
@@ -12774,7 +12774,7 @@
               <w:keepNext w:val="0"/>
               <w:spacing w:before="0" w:after="0" w:line="240" w:lineRule="auto"/>
             </w:pPr>
-            <w:hyperlink r:id="rId12" w:history="1">
+            <w:hyperlink r:id="rId27" w:history="1">
               <w:r>
                 <w:rPr>
                   <w:rFonts w:ascii="Arial" w:hAnsi="Arial"/>
@@ -12972,7 +12972,7 @@
               <w:keepNext w:val="0"/>
               <w:spacing w:before="0" w:after="0" w:line="240" w:lineRule="auto"/>
             </w:pPr>
-            <w:hyperlink r:id="rId12" w:history="1">
+            <w:hyperlink r:id="rId28" w:history="1">
               <w:r>
                 <w:rPr>
                   <w:rFonts w:ascii="Arial" w:hAnsi="Arial"/>
@@ -13170,7 +13170,7 @@
               <w:keepNext w:val="0"/>
               <w:spacing w:before="0" w:after="0" w:line="240" w:lineRule="auto"/>
             </w:pPr>
-            <w:hyperlink r:id="rId12" w:history="1">
+            <w:hyperlink r:id="rId29" w:history="1">
               <w:r>
                 <w:rPr>
                   <w:rFonts w:ascii="Arial" w:hAnsi="Arial"/>
@@ -13368,7 +13368,7 @@
               <w:keepNext w:val="0"/>
               <w:spacing w:before="0" w:after="0" w:line="240" w:lineRule="auto"/>
             </w:pPr>
-            <w:hyperlink r:id="rId12" w:history="1">
+            <w:hyperlink r:id="rId30" w:history="1">
               <w:r>
                 <w:rPr>
                   <w:rFonts w:ascii="Arial" w:hAnsi="Arial"/>
@@ -13566,7 +13566,7 @@
               <w:keepNext w:val="0"/>
               <w:spacing w:before="0" w:after="0" w:line="240" w:lineRule="auto"/>
             </w:pPr>
-            <w:hyperlink r:id="rId12" w:history="1">
+            <w:hyperlink r:id="rId31" w:history="1">
               <w:r>
                 <w:rPr>
                   <w:rFonts w:ascii="Arial" w:hAnsi="Arial"/>
@@ -13764,7 +13764,7 @@
               <w:keepNext w:val="0"/>
               <w:spacing w:before="0" w:after="0" w:line="240" w:lineRule="auto"/>
             </w:pPr>
-            <w:hyperlink r:id="rId12" w:history="1">
+            <w:hyperlink r:id="rId32" w:history="1">
               <w:r>
                 <w:rPr>
                   <w:rFonts w:ascii="Arial" w:hAnsi="Arial"/>
@@ -13962,7 +13962,7 @@
               <w:keepNext w:val="0"/>
               <w:spacing w:before="0" w:after="0" w:line="240" w:lineRule="auto"/>
             </w:pPr>
-            <w:hyperlink r:id="rId12" w:history="1">
+            <w:hyperlink r:id="rId21" w:history="1">
               <w:r>
                 <w:rPr>
                   <w:rFonts w:ascii="Arial" w:hAnsi="Arial"/>
@@ -14160,7 +14160,7 @@
               <w:keepNext w:val="0"/>
               <w:spacing w:before="0" w:after="0" w:line="240" w:lineRule="auto"/>
             </w:pPr>
-            <w:hyperlink r:id="rId12" w:history="1">
+            <w:hyperlink r:id="rId33" w:history="1">
               <w:r>
                 <w:rPr>
                   <w:rFonts w:ascii="Arial" w:hAnsi="Arial"/>
@@ -14358,7 +14358,7 @@
               <w:keepNext w:val="0"/>
               <w:spacing w:before="0" w:after="0" w:line="240" w:lineRule="auto"/>
             </w:pPr>
-            <w:hyperlink r:id="rId12" w:history="1">
+            <w:hyperlink r:id="rId27" w:history="1">
               <w:r>
                 <w:rPr>
                   <w:rFonts w:ascii="Arial" w:hAnsi="Arial"/>
@@ -14556,7 +14556,7 @@
               <w:keepNext w:val="0"/>
               <w:spacing w:before="0" w:after="0" w:line="240" w:lineRule="auto"/>
             </w:pPr>
-            <w:hyperlink r:id="rId12" w:history="1">
+            <w:hyperlink r:id="rId28" w:history="1">
               <w:r>
                 <w:rPr>
                   <w:rFonts w:ascii="Arial" w:hAnsi="Arial"/>
@@ -14754,7 +14754,7 @@
               <w:keepNext w:val="0"/>
               <w:spacing w:before="0" w:after="0" w:line="240" w:lineRule="auto"/>
             </w:pPr>
-            <w:hyperlink r:id="rId12" w:history="1">
+            <w:hyperlink r:id="rId29" w:history="1">
               <w:r>
                 <w:rPr>
                   <w:rFonts w:ascii="Arial" w:hAnsi="Arial"/>
@@ -14952,7 +14952,7 @@
               <w:keepNext w:val="0"/>
               <w:spacing w:before="0" w:after="0" w:line="240" w:lineRule="auto"/>
             </w:pPr>
-            <w:hyperlink r:id="rId12" w:history="1">
+            <w:hyperlink r:id="rId30" w:history="1">
               <w:r>
                 <w:rPr>
                   <w:rFonts w:ascii="Arial" w:hAnsi="Arial"/>
@@ -15150,7 +15150,7 @@
               <w:keepNext w:val="0"/>
               <w:spacing w:before="0" w:after="0" w:line="240" w:lineRule="auto"/>
             </w:pPr>
-            <w:hyperlink r:id="rId12" w:history="1">
+            <w:hyperlink r:id="rId31" w:history="1">
               <w:r>
                 <w:rPr>
                   <w:rFonts w:ascii="Arial" w:hAnsi="Arial"/>
@@ -15348,7 +15348,7 @@
               <w:keepNext w:val="0"/>
               <w:spacing w:before="0" w:after="0" w:line="240" w:lineRule="auto"/>
             </w:pPr>
-            <w:hyperlink r:id="rId12" w:history="1">
+            <w:hyperlink r:id="rId32" w:history="1">
               <w:r>
                 <w:rPr>
                   <w:rFonts w:ascii="Arial" w:hAnsi="Arial"/>
@@ -15546,7 +15546,7 @@
               <w:keepNext w:val="0"/>
               <w:spacing w:before="0" w:after="0" w:line="240" w:lineRule="auto"/>
             </w:pPr>
-            <w:hyperlink r:id="rId12" w:history="1">
+            <w:hyperlink r:id="rId21" w:history="1">
               <w:r>
                 <w:rPr>
                   <w:rFonts w:ascii="Arial" w:hAnsi="Arial"/>
@@ -15744,7 +15744,7 @@
               <w:keepNext w:val="0"/>
               <w:spacing w:before="0" w:after="0" w:line="240" w:lineRule="auto"/>
             </w:pPr>
-            <w:hyperlink r:id="rId12" w:history="1">
+            <w:hyperlink r:id="rId33" w:history="1">
               <w:r>
                 <w:rPr>
                   <w:rFonts w:ascii="Arial" w:hAnsi="Arial"/>
@@ -15942,7 +15942,7 @@
               <w:keepNext w:val="0"/>
               <w:spacing w:before="0" w:after="0" w:line="240" w:lineRule="auto"/>
             </w:pPr>
-            <w:hyperlink r:id="rId12" w:history="1">
+            <w:hyperlink r:id="rId27" w:history="1">
               <w:r>
                 <w:rPr>
                   <w:rFonts w:ascii="Arial" w:hAnsi="Arial"/>
@@ -16140,7 +16140,7 @@
               <w:keepNext w:val="0"/>
               <w:spacing w:before="0" w:after="0" w:line="240" w:lineRule="auto"/>
             </w:pPr>
-            <w:hyperlink r:id="rId12" w:history="1">
+            <w:hyperlink r:id="rId28" w:history="1">
               <w:r>
                 <w:rPr>
                   <w:rFonts w:ascii="Arial" w:hAnsi="Arial"/>
@@ -16338,7 +16338,7 @@
               <w:keepNext w:val="0"/>
               <w:spacing w:before="0" w:after="0" w:line="240" w:lineRule="auto"/>
             </w:pPr>
-            <w:hyperlink r:id="rId12" w:history="1">
+            <w:hyperlink r:id="rId29" w:history="1">
               <w:r>
                 <w:rPr>
                   <w:rFonts w:ascii="Arial" w:hAnsi="Arial"/>
@@ -16536,7 +16536,7 @@
               <w:keepNext w:val="0"/>
               <w:spacing w:before="0" w:after="0" w:line="240" w:lineRule="auto"/>
             </w:pPr>
-            <w:hyperlink r:id="rId12" w:history="1">
+            <w:hyperlink r:id="rId30" w:history="1">
               <w:r>
                 <w:rPr>
                   <w:rFonts w:ascii="Arial" w:hAnsi="Arial"/>
@@ -16734,7 +16734,7 @@
               <w:keepNext w:val="0"/>
               <w:spacing w:before="0" w:after="0" w:line="240" w:lineRule="auto"/>
             </w:pPr>
-            <w:hyperlink r:id="rId12" w:history="1">
+            <w:hyperlink r:id="rId34" w:history="1">
               <w:r>
                 <w:rPr>
                   <w:rFonts w:ascii="Arial" w:hAnsi="Arial"/>
@@ -16932,7 +16932,7 @@
               <w:keepNext w:val="0"/>
               <w:spacing w:before="0" w:after="0" w:line="240" w:lineRule="auto"/>
             </w:pPr>
-            <w:hyperlink r:id="rId12" w:history="1">
+            <w:hyperlink r:id="rId34" w:history="1">
               <w:r>
                 <w:rPr>
                   <w:rFonts w:ascii="Arial" w:hAnsi="Arial"/>
@@ -17130,7 +17130,7 @@
               <w:keepNext w:val="0"/>
               <w:spacing w:before="0" w:after="0" w:line="240" w:lineRule="auto"/>
             </w:pPr>
-            <w:hyperlink r:id="rId12" w:history="1">
+            <w:hyperlink r:id="rId35" w:history="1">
               <w:r>
                 <w:rPr>
                   <w:rFonts w:ascii="Arial" w:hAnsi="Arial"/>
@@ -17328,7 +17328,7 @@
               <w:keepNext w:val="0"/>
               <w:spacing w:before="0" w:after="0" w:line="240" w:lineRule="auto"/>
             </w:pPr>
-            <w:hyperlink r:id="rId12" w:history="1">
+            <w:hyperlink r:id="rId29" w:history="1">
               <w:r>
                 <w:rPr>
                   <w:rFonts w:ascii="Arial" w:hAnsi="Arial"/>
@@ -17526,7 +17526,7 @@
               <w:keepNext w:val="0"/>
               <w:spacing w:before="0" w:after="0" w:line="240" w:lineRule="auto"/>
             </w:pPr>
-            <w:hyperlink r:id="rId12" w:history="1">
+            <w:hyperlink r:id="rId36" w:history="1">
               <w:r>
                 <w:rPr>
                   <w:rFonts w:ascii="Arial" w:hAnsi="Arial"/>
@@ -17724,7 +17724,7 @@
               <w:keepNext w:val="0"/>
               <w:spacing w:before="0" w:after="0" w:line="240" w:lineRule="auto"/>
             </w:pPr>
-            <w:hyperlink r:id="rId12" w:history="1">
+            <w:hyperlink r:id="rId37" w:history="1">
               <w:r>
                 <w:rPr>
                   <w:rFonts w:ascii="Arial" w:hAnsi="Arial"/>
@@ -17922,7 +17922,7 @@
               <w:keepNext w:val="0"/>
               <w:spacing w:before="0" w:after="0" w:line="240" w:lineRule="auto"/>
             </w:pPr>
-            <w:hyperlink r:id="rId12" w:history="1">
+            <w:hyperlink r:id="rId32" w:history="1">
               <w:r>
                 <w:rPr>
                   <w:rFonts w:ascii="Arial" w:hAnsi="Arial"/>
@@ -18120,7 +18120,7 @@
               <w:keepNext w:val="0"/>
               <w:spacing w:before="0" w:after="0" w:line="240" w:lineRule="auto"/>
             </w:pPr>
-            <w:hyperlink r:id="rId12" w:history="1">
+            <w:hyperlink r:id="rId38" w:history="1">
               <w:r>
                 <w:rPr>
                   <w:rFonts w:ascii="Arial" w:hAnsi="Arial"/>
@@ -18318,7 +18318,7 @@
               <w:keepNext w:val="0"/>
               <w:spacing w:before="0" w:after="0" w:line="240" w:lineRule="auto"/>
             </w:pPr>
-            <w:hyperlink r:id="rId12" w:history="1">
+            <w:hyperlink r:id="rId39" w:history="1">
               <w:r>
                 <w:rPr>
                   <w:rFonts w:ascii="Arial" w:hAnsi="Arial"/>
@@ -18516,7 +18516,7 @@
               <w:keepNext w:val="0"/>
               <w:spacing w:before="0" w:after="0" w:line="240" w:lineRule="auto"/>
             </w:pPr>
-            <w:hyperlink r:id="rId12" w:history="1">
+            <w:hyperlink r:id="rId21" w:history="1">
               <w:r>
                 <w:rPr>
                   <w:rFonts w:ascii="Arial" w:hAnsi="Arial"/>
@@ -18714,7 +18714,7 @@
               <w:keepNext w:val="0"/>
               <w:spacing w:before="0" w:after="0" w:line="240" w:lineRule="auto"/>
             </w:pPr>
-            <w:hyperlink r:id="rId12" w:history="1">
+            <w:hyperlink r:id="rId40" w:history="1">
               <w:r>
                 <w:rPr>
                   <w:rFonts w:ascii="Arial" w:hAnsi="Arial"/>
@@ -18912,7 +18912,7 @@
               <w:keepNext w:val="0"/>
               <w:spacing w:before="0" w:after="0" w:line="240" w:lineRule="auto"/>
             </w:pPr>
-            <w:hyperlink r:id="rId12" w:history="1">
+            <w:hyperlink r:id="rId34" w:history="1">
               <w:r>
                 <w:rPr>
                   <w:rFonts w:ascii="Arial" w:hAnsi="Arial"/>
@@ -19110,7 +19110,7 @@
               <w:keepNext w:val="0"/>
               <w:spacing w:before="0" w:after="0" w:line="240" w:lineRule="auto"/>
             </w:pPr>
-            <w:hyperlink r:id="rId12" w:history="1">
+            <w:hyperlink r:id="rId34" w:history="1">
               <w:r>
                 <w:rPr>
                   <w:rFonts w:ascii="Arial" w:hAnsi="Arial"/>
@@ -19308,7 +19308,7 @@
               <w:keepNext w:val="0"/>
               <w:spacing w:before="0" w:after="0" w:line="240" w:lineRule="auto"/>
             </w:pPr>
-            <w:hyperlink r:id="rId12" w:history="1">
+            <w:hyperlink r:id="rId35" w:history="1">
               <w:r>
                 <w:rPr>
                   <w:rFonts w:ascii="Arial" w:hAnsi="Arial"/>
@@ -19506,7 +19506,7 @@
               <w:keepNext w:val="0"/>
               <w:spacing w:before="0" w:after="0" w:line="240" w:lineRule="auto"/>
             </w:pPr>
-            <w:hyperlink r:id="rId12" w:history="1">
+            <w:hyperlink r:id="rId29" w:history="1">
               <w:r>
                 <w:rPr>
                   <w:rFonts w:ascii="Arial" w:hAnsi="Arial"/>
@@ -19704,7 +19704,7 @@
               <w:keepNext w:val="0"/>
               <w:spacing w:before="0" w:after="0" w:line="240" w:lineRule="auto"/>
             </w:pPr>
-            <w:hyperlink r:id="rId12" w:history="1">
+            <w:hyperlink r:id="rId36" w:history="1">
               <w:r>
                 <w:rPr>
                   <w:rFonts w:ascii="Arial" w:hAnsi="Arial"/>
@@ -19902,7 +19902,7 @@
               <w:keepNext w:val="0"/>
               <w:spacing w:before="0" w:after="0" w:line="240" w:lineRule="auto"/>
             </w:pPr>
-            <w:hyperlink r:id="rId12" w:history="1">
+            <w:hyperlink r:id="rId37" w:history="1">
               <w:r>
                 <w:rPr>
                   <w:rFonts w:ascii="Arial" w:hAnsi="Arial"/>
@@ -20100,7 +20100,7 @@
               <w:keepNext w:val="0"/>
               <w:spacing w:before="0" w:after="0" w:line="240" w:lineRule="auto"/>
             </w:pPr>
-            <w:hyperlink r:id="rId12" w:history="1">
+            <w:hyperlink r:id="rId32" w:history="1">
               <w:r>
                 <w:rPr>
                   <w:rFonts w:ascii="Arial" w:hAnsi="Arial"/>
@@ -20298,7 +20298,7 @@
               <w:keepNext w:val="0"/>
               <w:spacing w:before="0" w:after="0" w:line="240" w:lineRule="auto"/>
             </w:pPr>
-            <w:hyperlink r:id="rId12" w:history="1">
+            <w:hyperlink r:id="rId38" w:history="1">
               <w:r>
                 <w:rPr>
                   <w:rFonts w:ascii="Arial" w:hAnsi="Arial"/>
@@ -20496,7 +20496,7 @@
               <w:keepNext w:val="0"/>
               <w:spacing w:before="0" w:after="0" w:line="240" w:lineRule="auto"/>
             </w:pPr>
-            <w:hyperlink r:id="rId12" w:history="1">
+            <w:hyperlink r:id="rId39" w:history="1">
               <w:r>
                 <w:rPr>
                   <w:rFonts w:ascii="Arial" w:hAnsi="Arial"/>
@@ -20694,7 +20694,7 @@
               <w:keepNext w:val="0"/>
               <w:spacing w:before="0" w:after="0" w:line="240" w:lineRule="auto"/>
             </w:pPr>
-            <w:hyperlink r:id="rId12" w:history="1">
+            <w:hyperlink r:id="rId21" w:history="1">
               <w:r>
                 <w:rPr>
                   <w:rFonts w:ascii="Arial" w:hAnsi="Arial"/>
@@ -20892,7 +20892,7 @@
               <w:keepNext w:val="0"/>
               <w:spacing w:before="0" w:after="0" w:line="240" w:lineRule="auto"/>
             </w:pPr>
-            <w:hyperlink r:id="rId12" w:history="1">
+            <w:hyperlink r:id="rId40" w:history="1">
               <w:r>
                 <w:rPr>
                   <w:rFonts w:ascii="Arial" w:hAnsi="Arial"/>
@@ -21090,7 +21090,7 @@
               <w:keepNext w:val="0"/>
               <w:spacing w:before="0" w:after="0" w:line="240" w:lineRule="auto"/>
             </w:pPr>
-            <w:hyperlink r:id="rId12" w:history="1">
+            <w:hyperlink r:id="rId34" w:history="1">
               <w:r>
                 <w:rPr>
                   <w:rFonts w:ascii="Arial" w:hAnsi="Arial"/>
@@ -21288,7 +21288,7 @@
               <w:keepNext w:val="0"/>
               <w:spacing w:before="0" w:after="0" w:line="240" w:lineRule="auto"/>
             </w:pPr>
-            <w:hyperlink r:id="rId12" w:history="1">
+            <w:hyperlink r:id="rId34" w:history="1">
               <w:r>
                 <w:rPr>
                   <w:rFonts w:ascii="Arial" w:hAnsi="Arial"/>
@@ -21486,7 +21486,7 @@
               <w:keepNext w:val="0"/>
               <w:spacing w:before="0" w:after="0" w:line="240" w:lineRule="auto"/>
             </w:pPr>
-            <w:hyperlink r:id="rId12" w:history="1">
+            <w:hyperlink r:id="rId35" w:history="1">
               <w:r>
                 <w:rPr>
                   <w:rFonts w:ascii="Arial" w:hAnsi="Arial"/>
@@ -21684,7 +21684,7 @@
               <w:keepNext w:val="0"/>
               <w:spacing w:before="0" w:after="0" w:line="240" w:lineRule="auto"/>
             </w:pPr>
-            <w:hyperlink r:id="rId12" w:history="1">
+            <w:hyperlink r:id="rId29" w:history="1">
               <w:r>
                 <w:rPr>
                   <w:rFonts w:ascii="Arial" w:hAnsi="Arial"/>
@@ -21882,7 +21882,7 @@
               <w:keepNext w:val="0"/>
               <w:spacing w:before="0" w:after="0" w:line="240" w:lineRule="auto"/>
             </w:pPr>
-            <w:hyperlink r:id="rId12" w:history="1">
+            <w:hyperlink r:id="rId36" w:history="1">
               <w:r>
                 <w:rPr>
                   <w:rFonts w:ascii="Arial" w:hAnsi="Arial"/>
@@ -22080,7 +22080,7 @@
               <w:keepNext w:val="0"/>
               <w:spacing w:before="0" w:after="0" w:line="240" w:lineRule="auto"/>
             </w:pPr>
-            <w:hyperlink r:id="rId12" w:history="1">
+            <w:hyperlink r:id="rId37" w:history="1">
               <w:r>
                 <w:rPr>
                   <w:rFonts w:ascii="Arial" w:hAnsi="Arial"/>
@@ -22278,7 +22278,7 @@
               <w:keepNext w:val="0"/>
               <w:spacing w:before="0" w:after="0" w:line="240" w:lineRule="auto"/>
             </w:pPr>
-            <w:hyperlink r:id="rId12" w:history="1">
+            <w:hyperlink r:id="rId32" w:history="1">
               <w:r>
                 <w:rPr>
                   <w:rFonts w:ascii="Arial" w:hAnsi="Arial"/>
@@ -22476,7 +22476,7 @@
               <w:keepNext w:val="0"/>
               <w:spacing w:before="0" w:after="0" w:line="240" w:lineRule="auto"/>
             </w:pPr>
-            <w:hyperlink r:id="rId12" w:history="1">
+            <w:hyperlink r:id="rId38" w:history="1">
               <w:r>
                 <w:rPr>
                   <w:rFonts w:ascii="Arial" w:hAnsi="Arial"/>
@@ -22674,7 +22674,7 @@
               <w:keepNext w:val="0"/>
               <w:spacing w:before="0" w:after="0" w:line="240" w:lineRule="auto"/>
             </w:pPr>
-            <w:hyperlink r:id="rId12" w:history="1">
+            <w:hyperlink r:id="rId39" w:history="1">
               <w:r>
                 <w:rPr>
                   <w:rFonts w:ascii="Arial" w:hAnsi="Arial"/>
@@ -22872,7 +22872,7 @@
               <w:keepNext w:val="0"/>
               <w:spacing w:before="0" w:after="0" w:line="240" w:lineRule="auto"/>
             </w:pPr>
-            <w:hyperlink r:id="rId12" w:history="1">
+            <w:hyperlink r:id="rId21" w:history="1">
               <w:r>
                 <w:rPr>
                   <w:rFonts w:ascii="Arial" w:hAnsi="Arial"/>
@@ -23070,7 +23070,7 @@
               <w:keepNext w:val="0"/>
               <w:spacing w:before="0" w:after="0" w:line="240" w:lineRule="auto"/>
             </w:pPr>
-            <w:hyperlink r:id="rId12" w:history="1">
+            <w:hyperlink r:id="rId40" w:history="1">
               <w:r>
                 <w:rPr>
                   <w:rFonts w:ascii="Arial" w:hAnsi="Arial"/>
@@ -23268,7 +23268,7 @@
               <w:keepNext w:val="0"/>
               <w:spacing w:before="0" w:after="0" w:line="240" w:lineRule="auto"/>
             </w:pPr>
-            <w:hyperlink r:id="rId12" w:history="1">
+            <w:hyperlink r:id="rId34" w:history="1">
               <w:r>
                 <w:rPr>
                   <w:rFonts w:ascii="Arial" w:hAnsi="Arial"/>
@@ -23466,7 +23466,7 @@
               <w:keepNext w:val="0"/>
               <w:spacing w:before="0" w:after="0" w:line="240" w:lineRule="auto"/>
             </w:pPr>
-            <w:hyperlink r:id="rId12" w:history="1">
+            <w:hyperlink r:id="rId34" w:history="1">
               <w:r>
                 <w:rPr>
                   <w:rFonts w:ascii="Arial" w:hAnsi="Arial"/>
@@ -23664,7 +23664,7 @@
               <w:keepNext w:val="0"/>
               <w:spacing w:before="0" w:after="0" w:line="240" w:lineRule="auto"/>
             </w:pPr>
-            <w:hyperlink r:id="rId12" w:history="1">
+            <w:hyperlink r:id="rId35" w:history="1">
               <w:r>
                 <w:rPr>
                   <w:rFonts w:ascii="Arial" w:hAnsi="Arial"/>
@@ -23862,7 +23862,7 @@
               <w:keepNext w:val="0"/>
               <w:spacing w:before="0" w:after="0" w:line="240" w:lineRule="auto"/>
             </w:pPr>
-            <w:hyperlink r:id="rId12" w:history="1">
+            <w:hyperlink r:id="rId29" w:history="1">
               <w:r>
                 <w:rPr>
                   <w:rFonts w:ascii="Arial" w:hAnsi="Arial"/>
@@ -24060,7 +24060,7 @@
               <w:keepNext w:val="0"/>
               <w:spacing w:before="0" w:after="0" w:line="240" w:lineRule="auto"/>
             </w:pPr>
-            <w:hyperlink r:id="rId12" w:history="1">
+            <w:hyperlink r:id="rId36" w:history="1">
               <w:r>
                 <w:rPr>
                   <w:rFonts w:ascii="Arial" w:hAnsi="Arial"/>
@@ -24258,7 +24258,7 @@
               <w:keepNext w:val="0"/>
               <w:spacing w:before="0" w:after="0" w:line="240" w:lineRule="auto"/>
             </w:pPr>
-            <w:hyperlink r:id="rId12" w:history="1">
+            <w:hyperlink r:id="rId37" w:history="1">
               <w:r>
                 <w:rPr>
                   <w:rFonts w:ascii="Arial" w:hAnsi="Arial"/>
@@ -24456,7 +24456,7 @@
               <w:keepNext w:val="0"/>
               <w:spacing w:before="0" w:after="0" w:line="240" w:lineRule="auto"/>
             </w:pPr>
-            <w:hyperlink r:id="rId12" w:history="1">
+            <w:hyperlink r:id="rId32" w:history="1">
               <w:r>
                 <w:rPr>
                   <w:rFonts w:ascii="Arial" w:hAnsi="Arial"/>
@@ -24654,7 +24654,7 @@
               <w:keepNext w:val="0"/>
               <w:spacing w:before="0" w:after="0" w:line="240" w:lineRule="auto"/>
             </w:pPr>
-            <w:hyperlink r:id="rId12" w:history="1">
+            <w:hyperlink r:id="rId38" w:history="1">
               <w:r>
                 <w:rPr>
                   <w:rFonts w:ascii="Arial" w:hAnsi="Arial"/>
@@ -24852,7 +24852,7 @@
               <w:keepNext w:val="0"/>
               <w:spacing w:before="0" w:after="0" w:line="240" w:lineRule="auto"/>
             </w:pPr>
-            <w:hyperlink r:id="rId12" w:history="1">
+            <w:hyperlink r:id="rId39" w:history="1">
               <w:r>
                 <w:rPr>
                   <w:rFonts w:ascii="Arial" w:hAnsi="Arial"/>
@@ -25050,7 +25050,7 @@
               <w:keepNext w:val="0"/>
               <w:spacing w:before="0" w:after="0" w:line="240" w:lineRule="auto"/>
             </w:pPr>
-            <w:hyperlink r:id="rId12" w:history="1">
+            <w:hyperlink r:id="rId21" w:history="1">
               <w:r>
                 <w:rPr>
                   <w:rFonts w:ascii="Arial" w:hAnsi="Arial"/>
@@ -25248,7 +25248,7 @@
               <w:keepNext w:val="0"/>
               <w:spacing w:before="0" w:after="0" w:line="240" w:lineRule="auto"/>
             </w:pPr>
-            <w:hyperlink r:id="rId12" w:history="1">
+            <w:hyperlink r:id="rId40" w:history="1">
               <w:r>
                 <w:rPr>
                   <w:rFonts w:ascii="Arial" w:hAnsi="Arial"/>
@@ -25446,7 +25446,7 @@
               <w:keepNext w:val="0"/>
               <w:spacing w:before="0" w:after="0" w:line="240" w:lineRule="auto"/>
             </w:pPr>
-            <w:hyperlink r:id="rId12" w:history="1">
+            <w:hyperlink r:id="rId41" w:history="1">
               <w:r>
                 <w:rPr>
                   <w:rFonts w:ascii="Arial" w:hAnsi="Arial"/>
@@ -25644,7 +25644,7 @@
               <w:keepNext w:val="0"/>
               <w:spacing w:before="0" w:after="0" w:line="240" w:lineRule="auto"/>
             </w:pPr>
-            <w:hyperlink r:id="rId12" w:history="1">
+            <w:hyperlink r:id="rId24" w:history="1">
               <w:r>
                 <w:rPr>
                   <w:rFonts w:ascii="Arial" w:hAnsi="Arial"/>
@@ -25842,7 +25842,7 @@
               <w:keepNext w:val="0"/>
               <w:spacing w:before="0" w:after="0" w:line="240" w:lineRule="auto"/>
             </w:pPr>
-            <w:hyperlink r:id="rId12" w:history="1">
+            <w:hyperlink r:id="rId41" w:history="1">
               <w:r>
                 <w:rPr>
                   <w:rFonts w:ascii="Arial" w:hAnsi="Arial"/>
@@ -26040,7 +26040,7 @@
               <w:keepNext w:val="0"/>
               <w:spacing w:before="0" w:after="0" w:line="240" w:lineRule="auto"/>
             </w:pPr>
-            <w:hyperlink r:id="rId12" w:history="1">
+            <w:hyperlink r:id="rId42" w:history="1">
               <w:r>
                 <w:rPr>
                   <w:rFonts w:ascii="Arial" w:hAnsi="Arial"/>
@@ -26238,7 +26238,7 @@
               <w:keepNext w:val="0"/>
               <w:spacing w:before="0" w:after="0" w:line="240" w:lineRule="auto"/>
             </w:pPr>
-            <w:hyperlink r:id="rId12" w:history="1">
+            <w:hyperlink r:id="rId33" w:history="1">
               <w:r>
                 <w:rPr>
                   <w:rFonts w:ascii="Arial" w:hAnsi="Arial"/>
@@ -26436,7 +26436,7 @@
               <w:keepNext w:val="0"/>
               <w:spacing w:before="0" w:after="0" w:line="240" w:lineRule="auto"/>
             </w:pPr>
-            <w:hyperlink r:id="rId12" w:history="1">
+            <w:hyperlink r:id="rId41" w:history="1">
               <w:r>
                 <w:rPr>
                   <w:rFonts w:ascii="Arial" w:hAnsi="Arial"/>
@@ -26634,7 +26634,7 @@
               <w:keepNext w:val="0"/>
               <w:spacing w:before="0" w:after="0" w:line="240" w:lineRule="auto"/>
             </w:pPr>
-            <w:hyperlink r:id="rId12" w:history="1">
+            <w:hyperlink r:id="rId24" w:history="1">
               <w:r>
                 <w:rPr>
                   <w:rFonts w:ascii="Arial" w:hAnsi="Arial"/>
@@ -26832,7 +26832,7 @@
               <w:keepNext w:val="0"/>
               <w:spacing w:before="0" w:after="0" w:line="240" w:lineRule="auto"/>
             </w:pPr>
-            <w:hyperlink r:id="rId12" w:history="1">
+            <w:hyperlink r:id="rId41" w:history="1">
               <w:r>
                 <w:rPr>
                   <w:rFonts w:ascii="Arial" w:hAnsi="Arial"/>
@@ -27030,7 +27030,7 @@
               <w:keepNext w:val="0"/>
               <w:spacing w:before="0" w:after="0" w:line="240" w:lineRule="auto"/>
             </w:pPr>
-            <w:hyperlink r:id="rId12" w:history="1">
+            <w:hyperlink r:id="rId42" w:history="1">
               <w:r>
                 <w:rPr>
                   <w:rFonts w:ascii="Arial" w:hAnsi="Arial"/>
@@ -27228,7 +27228,7 @@
               <w:keepNext w:val="0"/>
               <w:spacing w:before="0" w:after="0" w:line="240" w:lineRule="auto"/>
             </w:pPr>
-            <w:hyperlink r:id="rId12" w:history="1">
+            <w:hyperlink r:id="rId33" w:history="1">
               <w:r>
                 <w:rPr>
                   <w:rFonts w:ascii="Arial" w:hAnsi="Arial"/>
@@ -27426,7 +27426,7 @@
               <w:keepNext w:val="0"/>
               <w:spacing w:before="0" w:after="0" w:line="240" w:lineRule="auto"/>
             </w:pPr>
-            <w:hyperlink r:id="rId12" w:history="1">
+            <w:hyperlink r:id="rId41" w:history="1">
               <w:r>
                 <w:rPr>
                   <w:rFonts w:ascii="Arial" w:hAnsi="Arial"/>
@@ -27624,7 +27624,7 @@
               <w:keepNext w:val="0"/>
               <w:spacing w:before="0" w:after="0" w:line="240" w:lineRule="auto"/>
             </w:pPr>
-            <w:hyperlink r:id="rId12" w:history="1">
+            <w:hyperlink r:id="rId24" w:history="1">
               <w:r>
                 <w:rPr>
                   <w:rFonts w:ascii="Arial" w:hAnsi="Arial"/>
@@ -27822,7 +27822,7 @@
               <w:keepNext w:val="0"/>
               <w:spacing w:before="0" w:after="0" w:line="240" w:lineRule="auto"/>
             </w:pPr>
-            <w:hyperlink r:id="rId12" w:history="1">
+            <w:hyperlink r:id="rId41" w:history="1">
               <w:r>
                 <w:rPr>
                   <w:rFonts w:ascii="Arial" w:hAnsi="Arial"/>
@@ -28020,7 +28020,7 @@
               <w:keepNext w:val="0"/>
               <w:spacing w:before="0" w:after="0" w:line="240" w:lineRule="auto"/>
             </w:pPr>
-            <w:hyperlink r:id="rId12" w:history="1">
+            <w:hyperlink r:id="rId42" w:history="1">
               <w:r>
                 <w:rPr>
                   <w:rFonts w:ascii="Arial" w:hAnsi="Arial"/>
@@ -28218,7 +28218,7 @@
               <w:keepNext w:val="0"/>
               <w:spacing w:before="0" w:after="0" w:line="240" w:lineRule="auto"/>
             </w:pPr>
-            <w:hyperlink r:id="rId12" w:history="1">
+            <w:hyperlink r:id="rId33" w:history="1">
               <w:r>
                 <w:rPr>
                   <w:rFonts w:ascii="Arial" w:hAnsi="Arial"/>
@@ -28416,7 +28416,7 @@
               <w:keepNext w:val="0"/>
               <w:spacing w:before="0" w:after="0" w:line="240" w:lineRule="auto"/>
             </w:pPr>
-            <w:hyperlink r:id="rId12" w:history="1">
+            <w:hyperlink r:id="rId41" w:history="1">
               <w:r>
                 <w:rPr>
                   <w:rFonts w:ascii="Arial" w:hAnsi="Arial"/>

</xml_diff>